<commit_message>
Ajustes no template da Ordem de Coleta
- Adiciona Data de Emissao (data real de geracao) separada da Data de Carregamento, ambas com label em negrito.
- Corrige enderego do remetente: Cipo -> Conceicao do Jacuipe.
- Forca cor preta no texto das barras de secao (Ordem de Carregamento, Dados Remetente, etc), que estava com baixo contraste ao converter para PDF.
- Labels do motorista/veiculo (Motorista:, CNH:, Fone:, 1a/2a/3a Placa:) agora sempre em negrito, valores normais.
- Troca a logo generica do template pela logo real do sistema (convertida do logo.svg).
</commit_message>
<xml_diff>
--- a/backend/dados/O.C_AFL.docx
+++ b/backend/dados/O.C_AFL.docx
@@ -300,6 +300,7 @@
           <w:noProof/>
           <w:position w:val="-3"/>
           <w:sz w:val="20"/>
+          <w:color w:val="000000"/>
         </w:rPr>
         <mc:AlternateContent>
           <mc:Choice Requires="wps">
@@ -394,6 +395,7 @@
                                 <w:rFonts w:ascii="Arial"/>
                                 <w:b/>
                                 <w:sz w:val="14"/>
+                                <w:color w:val="000000"/>
                               </w:rPr>
                               <w:t xml:space="preserve">                                                                                           Ordem</w:t>
                             </w:r>
@@ -403,6 +405,7 @@
                                 <w:b/>
                                 <w:spacing w:val="-7"/>
                                 <w:sz w:val="14"/>
+                                <w:color w:val="000000"/>
                               </w:rPr>
                               <w:t xml:space="preserve"> </w:t>
                             </w:r>
@@ -411,6 +414,7 @@
                                 <w:rFonts w:ascii="Arial"/>
                                 <w:b/>
                                 <w:sz w:val="14"/>
+                                <w:color w:val="000000"/>
                               </w:rPr>
                               <w:t>de</w:t>
                             </w:r>
@@ -420,6 +424,7 @@
                                 <w:b/>
                                 <w:spacing w:val="-6"/>
                                 <w:sz w:val="14"/>
+                                <w:color w:val="000000"/>
                               </w:rPr>
                               <w:t xml:space="preserve"> </w:t>
                             </w:r>
@@ -428,6 +433,7 @@
                                 <w:rFonts w:ascii="Arial"/>
                                 <w:b/>
                                 <w:sz w:val="14"/>
+                                <w:color w:val="000000"/>
                               </w:rPr>
                               <w:t>Carregamento</w:t>
                             </w:r>
@@ -472,6 +478,7 @@
                           <w:rFonts w:ascii="Arial"/>
                           <w:b/>
                           <w:sz w:val="14"/>
+                          <w:color w:val="000000"/>
                         </w:rPr>
                         <w:t xml:space="preserve">                                                                                           Ordem</w:t>
                       </w:r>
@@ -481,6 +488,7 @@
                           <w:b/>
                           <w:spacing w:val="-7"/>
                           <w:sz w:val="14"/>
+                          <w:color w:val="000000"/>
                         </w:rPr>
                         <w:t xml:space="preserve"> </w:t>
                       </w:r>
@@ -489,6 +497,7 @@
                           <w:rFonts w:ascii="Arial"/>
                           <w:b/>
                           <w:sz w:val="14"/>
+                          <w:color w:val="000000"/>
                         </w:rPr>
                         <w:t>de</w:t>
                       </w:r>
@@ -498,6 +507,7 @@
                           <w:b/>
                           <w:spacing w:val="-6"/>
                           <w:sz w:val="14"/>
+                          <w:color w:val="000000"/>
                         </w:rPr>
                         <w:t xml:space="preserve"> </w:t>
                       </w:r>
@@ -506,6 +516,7 @@
                           <w:rFonts w:ascii="Arial"/>
                           <w:b/>
                           <w:sz w:val="14"/>
+                          <w:color w:val="000000"/>
                         </w:rPr>
                         <w:t>Carregamento</w:t>
                       </w:r>
@@ -522,6 +533,25 @@
     <w:p/>
     <w:p>
       <w:r>
+        <w:rPr>
+          <w:rFonts w:ascii="Arial" w:hAnsi="Arial"/>
+          <w:b/>
+        </w:rPr>
+        <w:t xml:space="preserve">Data de Emissão: </w:t>
+      </w:r>
+      <w:r>
+        <w:t>00/00/0000</w:t>
+      </w:r>
+    </w:p>
+    <w:p>
+      <w:r>
+        <w:rPr>
+          <w:rFonts w:ascii="Arial" w:hAnsi="Arial"/>
+          <w:b/>
+        </w:rPr>
+        <w:t xml:space="preserve">Data de Carregamento: </w:t>
+      </w:r>
+      <w:r>
         <w:t>00/00/0000</w:t>
       </w:r>
     </w:p>
@@ -532,6 +562,7 @@
           <w:noProof/>
           <w:position w:val="-3"/>
           <w:sz w:val="20"/>
+          <w:color w:val="000000"/>
         </w:rPr>
         <mc:AlternateContent>
           <mc:Choice Requires="wps">
@@ -626,6 +657,7 @@
                                 <w:rFonts w:ascii="Arial"/>
                                 <w:b/>
                                 <w:sz w:val="14"/>
+                                <w:color w:val="000000"/>
                               </w:rPr>
                               <w:t xml:space="preserve">                                                                                                Dados</w:t>
                             </w:r>
@@ -635,6 +667,7 @@
                                 <w:b/>
                                 <w:spacing w:val="-7"/>
                                 <w:sz w:val="14"/>
+                                <w:color w:val="000000"/>
                               </w:rPr>
                               <w:t xml:space="preserve"> </w:t>
                             </w:r>
@@ -643,6 +676,7 @@
                                 <w:rFonts w:ascii="Arial"/>
                                 <w:b/>
                                 <w:sz w:val="14"/>
+                                <w:color w:val="000000"/>
                               </w:rPr>
                               <w:t>Remetente</w:t>
                             </w:r>
@@ -683,6 +717,7 @@
                           <w:rFonts w:ascii="Arial"/>
                           <w:b/>
                           <w:sz w:val="14"/>
+                          <w:color w:val="000000"/>
                         </w:rPr>
                         <w:t xml:space="preserve">                                                                                                Dados</w:t>
                       </w:r>
@@ -692,6 +727,7 @@
                           <w:b/>
                           <w:spacing w:val="-7"/>
                           <w:sz w:val="14"/>
+                          <w:color w:val="000000"/>
                         </w:rPr>
                         <w:t xml:space="preserve"> </w:t>
                       </w:r>
@@ -700,6 +736,7 @@
                           <w:rFonts w:ascii="Arial"/>
                           <w:b/>
                           <w:sz w:val="14"/>
+                          <w:color w:val="000000"/>
                         </w:rPr>
                         <w:t>Remetente</w:t>
                       </w:r>
@@ -788,7 +825,7 @@
           <w:sz w:val="18"/>
           <w:szCs w:val="18"/>
         </w:rPr>
-        <w:t>ROD SALVADOR-FEIRA DE SANTANA, S/N, BR 324 KM 537 - BESSA - CIPO/BA</w:t>
+        <w:t>ROD SALVADOR-FEIRA DE SANTANA, S/N, BR 324 KM 537 - BESSA - CONCEIÇÃO DO JACUÍPE/BA</w:t>
       </w:r>
       <w:r>
         <w:rPr>
@@ -845,6 +882,7 @@
       <w:r>
         <w:rPr>
           <w:noProof/>
+          <w:color w:val="000000"/>
         </w:rPr>
         <mc:AlternateContent>
           <mc:Choice Requires="wps">
@@ -939,6 +977,7 @@
                                 <w:rFonts w:ascii="Arial"/>
                                 <w:b/>
                                 <w:sz w:val="14"/>
+                                <w:color w:val="000000"/>
                               </w:rPr>
                               <w:t xml:space="preserve">                                                                                              Dados</w:t>
                             </w:r>
@@ -948,6 +987,7 @@
                                 <w:b/>
                                 <w:spacing w:val="-9"/>
                                 <w:sz w:val="14"/>
+                                <w:color w:val="000000"/>
                               </w:rPr>
                               <w:t xml:space="preserve"> </w:t>
                             </w:r>
@@ -956,6 +996,7 @@
                                 <w:rFonts w:ascii="Arial"/>
                                 <w:b/>
                                 <w:sz w:val="14"/>
+                                <w:color w:val="000000"/>
                               </w:rPr>
                               <w:t>Carregamento</w:t>
                             </w:r>
@@ -999,6 +1040,7 @@
                           <w:rFonts w:ascii="Arial"/>
                           <w:b/>
                           <w:sz w:val="14"/>
+                          <w:color w:val="000000"/>
                         </w:rPr>
                         <w:t xml:space="preserve">                                                                                              Dados</w:t>
                       </w:r>
@@ -1008,6 +1050,7 @@
                           <w:b/>
                           <w:spacing w:val="-9"/>
                           <w:sz w:val="14"/>
+                          <w:color w:val="000000"/>
                         </w:rPr>
                         <w:t xml:space="preserve"> </w:t>
                       </w:r>
@@ -1016,6 +1059,7 @@
                           <w:rFonts w:ascii="Arial"/>
                           <w:b/>
                           <w:sz w:val="14"/>
+                          <w:color w:val="000000"/>
                         </w:rPr>
                         <w:t>Carregamento</w:t>
                       </w:r>
@@ -1217,6 +1261,7 @@
           <w:noProof/>
           <w:position w:val="-3"/>
           <w:sz w:val="18"/>
+          <w:color w:val="000000"/>
         </w:rPr>
         <mc:AlternateContent>
           <mc:Choice Requires="wps">
@@ -1312,6 +1357,7 @@
                                 <w:rFonts w:ascii="Arial"/>
                                 <w:b/>
                                 <w:sz w:val="14"/>
+                                <w:color w:val="000000"/>
                               </w:rPr>
                               <w:t>Dados do Motorista</w:t>
                             </w:r>
@@ -1350,6 +1396,7 @@
                           <w:rFonts w:ascii="Arial"/>
                           <w:b/>
                           <w:sz w:val="14"/>
+                          <w:color w:val="000000"/>
                         </w:rPr>
                         <w:t>Dados do Motorista</w:t>
                       </w:r>
@@ -1483,6 +1530,7 @@
           <w:noProof/>
           <w:position w:val="-3"/>
           <w:sz w:val="20"/>
+          <w:color w:val="000000"/>
         </w:rPr>
         <mc:AlternateContent>
           <mc:Choice Requires="wps">
@@ -1570,6 +1618,7 @@
                                 <w:rFonts w:ascii="Arial" w:hAnsi="Arial"/>
                                 <w:b/>
                                 <w:sz w:val="14"/>
+                                <w:color w:val="000000"/>
                               </w:rPr>
                               <w:t>Dados</w:t>
                             </w:r>
@@ -1579,6 +1628,7 @@
                                 <w:b/>
                                 <w:spacing w:val="-7"/>
                                 <w:sz w:val="14"/>
+                                <w:color w:val="000000"/>
                               </w:rPr>
                               <w:t xml:space="preserve"> </w:t>
                             </w:r>
@@ -1587,6 +1637,7 @@
                                 <w:rFonts w:ascii="Arial" w:hAnsi="Arial"/>
                                 <w:b/>
                                 <w:sz w:val="14"/>
+                                <w:color w:val="000000"/>
                               </w:rPr>
                               <w:t>Caminhão</w:t>
                             </w:r>
@@ -1625,6 +1676,7 @@
                           <w:rFonts w:ascii="Arial" w:hAnsi="Arial"/>
                           <w:b/>
                           <w:sz w:val="14"/>
+                          <w:color w:val="000000"/>
                         </w:rPr>
                         <w:t>Dados</w:t>
                       </w:r>
@@ -1634,6 +1686,7 @@
                           <w:b/>
                           <w:spacing w:val="-7"/>
                           <w:sz w:val="14"/>
+                          <w:color w:val="000000"/>
                         </w:rPr>
                         <w:t xml:space="preserve"> </w:t>
                       </w:r>
@@ -1642,6 +1695,7 @@
                           <w:rFonts w:ascii="Arial" w:hAnsi="Arial"/>
                           <w:b/>
                           <w:sz w:val="14"/>
+                          <w:color w:val="000000"/>
                         </w:rPr>
                         <w:t>Caminhão</w:t>
                       </w:r>
@@ -1730,6 +1784,7 @@
           <w:noProof/>
           <w:position w:val="-3"/>
           <w:sz w:val="20"/>
+          <w:color w:val="000000"/>
         </w:rPr>
         <mc:AlternateContent>
           <mc:Choice Requires="wps">
@@ -1817,6 +1872,7 @@
                                 <w:rFonts w:ascii="Arial" w:hAnsi="Arial"/>
                                 <w:b/>
                                 <w:sz w:val="14"/>
+                                <w:color w:val="000000"/>
                               </w:rPr>
                               <w:t>Observações</w:t>
                             </w:r>
@@ -1855,6 +1911,7 @@
                           <w:rFonts w:ascii="Arial" w:hAnsi="Arial"/>
                           <w:b/>
                           <w:sz w:val="14"/>
+                          <w:color w:val="000000"/>
                         </w:rPr>
                         <w:t>Observações</w:t>
                       </w:r>

</xml_diff>

<commit_message>
Remove Data de Carregamento da O.C. e corrige cor do cabecalho da tabela
- Remove o paragrafo 'Data de Carregamento' do documento (fica so 'Data de Emissao').
- Cabecalho da tabela de produtos (Pedido/Produto/Embalagem/Peso/Cidade/Cliente) estava com fundo verde aplicado de forma inconsistente entre colunas ao converter para PDF; troca para texto preto em negrito sem fundo colorido, garantindo leitura uniforme em todas as colunas.
</commit_message>
<xml_diff>
--- a/backend/dados/O.C_AFL.docx
+++ b/backend/dados/O.C_AFL.docx
@@ -538,18 +538,6 @@
           <w:b/>
         </w:rPr>
         <w:t xml:space="preserve">Data de Emissão: </w:t>
-      </w:r>
-      <w:r>
-        <w:t>00/00/0000</w:t>
-      </w:r>
-    </w:p>
-    <w:p>
-      <w:r>
-        <w:rPr>
-          <w:rFonts w:ascii="Arial" w:hAnsi="Arial"/>
-          <w:b/>
-        </w:rPr>
-        <w:t xml:space="preserve">Data de Carregamento: </w:t>
       </w:r>
       <w:r>
         <w:t>00/00/0000</w:t>

</xml_diff>

<commit_message>
Adiciona a 6a coluna (Cliente) nativamente no template da O.C.
O template original so tinha 5 colunas na grade da tabela; a coluna Cliente era adicionada em tempo de execucao via table.add_column(), o que causava uma sombra verde residual renderizada pelo LibreOffice mesmo com o XML da celula marcado como branco. Agora a 6a coluna ja existe nativamente no arquivo .docx, com sombra branca explicita em todas as celulas, eliminando a necessidade do add_column() em tempo de execucao.
</commit_message>
<xml_diff>
--- a/backend/dados/O.C_AFL.docx
+++ b/backend/dados/O.C_AFL.docx
@@ -1097,12 +1097,13 @@
         <w:gridCol w:w="708"/>
         <w:gridCol w:w="1560"/>
         <w:gridCol w:w="2403"/>
+        <w:gridCol w:w="2002"/>
       </w:tblGrid>
       <w:tr>
         <w:tc>
           <w:tcPr>
             <w:tcW w:w="988" w:type="dxa"/>
-            <w:shd w:val="clear" w:color="auto" w:fill="E7E6E6" w:themeFill="background2"/>
+            <w:shd w:val="clear" w:color="auto" w:fill="FFFFFF" w:themeFill="background2"/>
           </w:tcPr>
           <w:p>
             <w:pPr>
@@ -1126,7 +1127,7 @@
         <w:tc>
           <w:tcPr>
             <w:tcW w:w="2835" w:type="dxa"/>
-            <w:shd w:val="clear" w:color="auto" w:fill="E7E6E6" w:themeFill="background2"/>
+            <w:shd w:val="clear" w:color="auto" w:fill="FFFFFF" w:themeFill="background2"/>
           </w:tcPr>
           <w:p>
             <w:pPr>
@@ -1150,7 +1151,7 @@
         <w:tc>
           <w:tcPr>
             <w:tcW w:w="708" w:type="dxa"/>
-            <w:shd w:val="clear" w:color="auto" w:fill="E7E6E6" w:themeFill="background2"/>
+            <w:shd w:val="clear" w:color="auto" w:fill="FFFFFF" w:themeFill="background2"/>
           </w:tcPr>
           <w:p>
             <w:pPr>
@@ -1174,7 +1175,7 @@
         <w:tc>
           <w:tcPr>
             <w:tcW w:w="1560" w:type="dxa"/>
-            <w:shd w:val="clear" w:color="auto" w:fill="E7E6E6" w:themeFill="background2"/>
+            <w:shd w:val="clear" w:color="auto" w:fill="FFFFFF" w:themeFill="background2"/>
           </w:tcPr>
           <w:p>
             <w:pPr>
@@ -1198,7 +1199,7 @@
         <w:tc>
           <w:tcPr>
             <w:tcW w:w="2403" w:type="dxa"/>
-            <w:shd w:val="clear" w:color="auto" w:fill="E7E6E6" w:themeFill="background2"/>
+            <w:shd w:val="clear" w:color="auto" w:fill="FFFFFF" w:themeFill="background2"/>
           </w:tcPr>
           <w:p>
             <w:pPr>
@@ -1218,6 +1219,13 @@
               <w:t>Cliente</w:t>
             </w:r>
           </w:p>
+        </w:tc>
+        <w:tc>
+          <w:tcPr>
+            <w:tcW w:type="dxa" w:w="2002"/>
+            <w:shd w:fill="FFFFFF"/>
+          </w:tcPr>
+          <w:p/>
         </w:tc>
       </w:tr>
     </w:tbl>

</xml_diff>

<commit_message>
Redesenha visual da O.C.: barras verdes arredondadas e tabela com zebra
Aproxima o layout do mockup fornecido: troca a cor tema (accent5) dos cabecalhos de secao de azul para verde e arredonda os cantos das barras (rect -> roundRect). Tabela de produtos ganha cabecalho escuro com texto branco e linhas de dados com listras alternadas (zebra), facilitando a leitura de varios itens.
</commit_message>
<xml_diff>
--- a/backend/dados/O.C_AFL.docx
+++ b/backend/dados/O.C_AFL.docx
@@ -331,7 +331,7 @@
                           <a:off x="0" y="0"/>
                           <a:ext cx="5400040" cy="136478"/>
                         </a:xfrm>
-                        <a:prstGeom prst="rect">
+                        <a:prstGeom prst="roundRect">
                           <a:avLst/>
                         </a:prstGeom>
                         <a:gradFill rotWithShape="0">
@@ -581,7 +581,7 @@
                           <a:off x="0" y="0"/>
                           <a:ext cx="5400040" cy="134636"/>
                         </a:xfrm>
-                        <a:prstGeom prst="rect">
+                        <a:prstGeom prst="roundRect">
                           <a:avLst/>
                         </a:prstGeom>
                         <a:gradFill rotWithShape="0">
@@ -901,7 +901,7 @@
                           <a:off x="0" y="0"/>
                           <a:ext cx="5417185" cy="115570"/>
                         </a:xfrm>
-                        <a:prstGeom prst="rect">
+                        <a:prstGeom prst="roundRect">
                           <a:avLst/>
                         </a:prstGeom>
                         <a:gradFill rotWithShape="0">
@@ -1288,7 +1288,7 @@
                           <a:off x="0" y="0"/>
                           <a:ext cx="5400040" cy="131674"/>
                         </a:xfrm>
-                        <a:prstGeom prst="rect">
+                        <a:prstGeom prst="roundRect">
                           <a:avLst/>
                         </a:prstGeom>
                         <a:gradFill rotWithShape="0">
@@ -1549,7 +1549,7 @@
                           <a:off x="0" y="0"/>
                           <a:ext cx="5400040" cy="151075"/>
                         </a:xfrm>
-                        <a:prstGeom prst="rect">
+                        <a:prstGeom prst="roundRect">
                           <a:avLst/>
                         </a:prstGeom>
                         <a:gradFill rotWithShape="0">
@@ -1803,7 +1803,7 @@
                           <a:off x="0" y="0"/>
                           <a:ext cx="5400040" cy="127000"/>
                         </a:xfrm>
-                        <a:prstGeom prst="rect">
+                        <a:prstGeom prst="roundRect">
                           <a:avLst/>
                         </a:prstGeom>
                         <a:gradFill rotWithShape="0">
@@ -3269,7 +3269,7 @@
         <a:srgbClr val="FFC000"/>
       </a:accent4>
       <a:accent5>
-        <a:srgbClr val="5B9BD5"/>
+        <a:srgbClr val="3F722A"/>
       </a:accent5>
       <a:accent6>
         <a:srgbClr val="70AD47"/>

</xml_diff>

<commit_message>
Revert "Redesenha visual da O.C.: barras verdes arredondadas e tabela com zebra"
This reverts commit af4c5c0000604e10eb08e73e7afc1c3679448294.
</commit_message>
<xml_diff>
--- a/backend/dados/O.C_AFL.docx
+++ b/backend/dados/O.C_AFL.docx
@@ -331,7 +331,7 @@
                           <a:off x="0" y="0"/>
                           <a:ext cx="5400040" cy="136478"/>
                         </a:xfrm>
-                        <a:prstGeom prst="roundRect">
+                        <a:prstGeom prst="rect">
                           <a:avLst/>
                         </a:prstGeom>
                         <a:gradFill rotWithShape="0">
@@ -581,7 +581,7 @@
                           <a:off x="0" y="0"/>
                           <a:ext cx="5400040" cy="134636"/>
                         </a:xfrm>
-                        <a:prstGeom prst="roundRect">
+                        <a:prstGeom prst="rect">
                           <a:avLst/>
                         </a:prstGeom>
                         <a:gradFill rotWithShape="0">
@@ -901,7 +901,7 @@
                           <a:off x="0" y="0"/>
                           <a:ext cx="5417185" cy="115570"/>
                         </a:xfrm>
-                        <a:prstGeom prst="roundRect">
+                        <a:prstGeom prst="rect">
                           <a:avLst/>
                         </a:prstGeom>
                         <a:gradFill rotWithShape="0">
@@ -1288,7 +1288,7 @@
                           <a:off x="0" y="0"/>
                           <a:ext cx="5400040" cy="131674"/>
                         </a:xfrm>
-                        <a:prstGeom prst="roundRect">
+                        <a:prstGeom prst="rect">
                           <a:avLst/>
                         </a:prstGeom>
                         <a:gradFill rotWithShape="0">
@@ -1549,7 +1549,7 @@
                           <a:off x="0" y="0"/>
                           <a:ext cx="5400040" cy="151075"/>
                         </a:xfrm>
-                        <a:prstGeom prst="roundRect">
+                        <a:prstGeom prst="rect">
                           <a:avLst/>
                         </a:prstGeom>
                         <a:gradFill rotWithShape="0">
@@ -1803,7 +1803,7 @@
                           <a:off x="0" y="0"/>
                           <a:ext cx="5400040" cy="127000"/>
                         </a:xfrm>
-                        <a:prstGeom prst="roundRect">
+                        <a:prstGeom prst="rect">
                           <a:avLst/>
                         </a:prstGeom>
                         <a:gradFill rotWithShape="0">
@@ -3269,7 +3269,7 @@
         <a:srgbClr val="FFC000"/>
       </a:accent4>
       <a:accent5>
-        <a:srgbClr val="3F722A"/>
+        <a:srgbClr val="5B9BD5"/>
       </a:accent5>
       <a:accent6>
         <a:srgbClr val="70AD47"/>

</xml_diff>